<commit_message>
Accuracy upgrade: five years of RBI data, Sunday correction, evidence-based recognition on shared dates
- RBI holiday matrix extended to 2022-2026 and re-collected
- Sunday correction: festivals averaged only over the years they could be listed
- Recognition measure: a festival a state is confirmed to observe counts in full on shared dates
  (evidence: RBI unique dates, DoPT compulsory-holiday list, home community)
- Telangana / Andhra Pradesh rebuilt from Census 2011 district tables
- Fixed Chhath pattern matching Vinayakar Chathurthi
- Bootstrap confidence intervals and Holm correction for the demography tests
- Statistics, ML, charts, blog source, report, status report and video regenerated
</commit_message>
<xml_diff>
--- a/report/DAV Project Report_23108B0084.docx
+++ b/report/DAV Project Report_23108B0084.docx
@@ -722,7 +722,7 @@
                 <w:b w:val="0"/>
                 <w:sz w:val="20"/>
               </w:rPr>
-              <w:t>Data sources (all real, cited per record): Reserve Bank of India holiday matrix 2024-26 (rbi.org.in); Census of India 2011 Table C-01 (censusindia.gov.in); Wikipedia infoboxes via MediaWiki API + Govt. portals (utsav.gov.in, soreng.nic.in, dtahills.mn.gov.in, megtourism.gov.in); CAIT (cait.in) and verified news for spending; NRF, gov.cn, GASTAT, muenchen.de for global analogues; DataMeet state boundaries (CC BY 2.5 IN).</w:t>
+              <w:t>Data sources (all real, cited per record): Reserve Bank of India holiday matrix 2022-26 (rbi.org.in); DoPT compulsory-holiday list (O.M. F.No.12/2/2023-JCA); Census of India 2011 Table C-01 (censusindia.gov.in); Wikipedia infoboxes via MediaWiki API + Govt. portals (utsav.gov.in, soreng.nic.in, dtahills.mn.gov.in, megtourism.gov.in); CAIT (cait.in) and verified news for spending; NRF, gov.cn, GASTAT, muenchen.de for global analogues; DataMeet state boundaries (CC BY 2.5 IN).</w:t>
             </w:r>
           </w:p>
         </w:tc>
@@ -876,7 +876,7 @@
                 <w:b w:val="0"/>
                 <w:sz w:val="20"/>
               </w:rPr>
-              <w:t>1. Scrape the RBI holiday matrix for every office/month/year (2,031 office-date rows), save raw HTML + CSV with source URL per row.</w:t>
+              <w:t>1. Scrape the RBI holiday matrix for every office and month of 2022-2026 (3,221 office-date rows), save raw HTML + CSV with source URL per row.</w:t>
             </w:r>
           </w:p>
           <w:p>
@@ -888,7 +888,7 @@
                 <w:b w:val="0"/>
                 <w:sz w:val="20"/>
               </w:rPr>
-              <w:t>2. Build a 99-festival regex catalog; resolve each RBI label into festivals; split shared-date closures with attribution_weight = 1/k; flag festivals whose reach is not identifiable.</w:t>
+              <w:t>2. Build a 101-festival regex catalog and resolve each RBI label into festivals. Shared dates are credited by evidence: a festival counts in full where the office is confirmed to observe it (closed on a date where it stood alone, on the DoPT compulsory list and never absent, or the festival's home community); the rest is split by an evidence score and flagged. Sunday correction: each festival is averaged only over the years it could be listed.</w:t>
             </w:r>
           </w:p>
           <w:p>
@@ -1104,7 +1104,7 @@
                 <w:b w:val="0"/>
                 <w:sz w:val="20"/>
               </w:rPr>
-              <w:t>2,705 festival-holiday observations | 99 festivals | 34 RBI offices | 29 states/UTs | 2024-2026 | 78 verified economic/footfall records | Census 2011 demography. Zero synthetic records.</w:t>
+              <w:t>3,271 festival-holiday observations | 101 festivals | 34 RBI offices | 29 states/UTs | 2022-2026 | 78 verified economic/footfall records | Census 2011 demography. Zero synthetic records.</w:t>
             </w:r>
           </w:p>
           <w:p>
@@ -1243,35 +1243,35 @@
                       <w:b w:val="0"/>
                       <w:sz w:val="16"/>
                     </w:rPr>
-                    <w:t>7.22</w:t>
-                  </w:r>
-                </w:p>
-              </w:tc>
-              <w:tc>
-                <w:tcPr>
-                  <w:tcW w:type="dxa" w:w="1812"/>
-                </w:tcPr>
-                <w:p>
-                  <w:r>
-                    <w:rPr>
-                      <w:b w:val="0"/>
-                      <w:sz w:val="16"/>
-                    </w:rPr>
-                    <w:t>46.5</w:t>
-                  </w:r>
-                </w:p>
-              </w:tc>
-              <w:tc>
-                <w:tcPr>
-                  <w:tcW w:type="dxa" w:w="1812"/>
-                </w:tcPr>
-                <w:p>
-                  <w:r>
-                    <w:rPr>
-                      <w:b w:val="0"/>
-                      <w:sz w:val="16"/>
-                    </w:rPr>
-                    <w:t>68.89</w:t>
+                    <w:t>8.58</w:t>
+                  </w:r>
+                </w:p>
+              </w:tc>
+              <w:tc>
+                <w:tcPr>
+                  <w:tcW w:type="dxa" w:w="1812"/>
+                </w:tcPr>
+                <w:p>
+                  <w:r>
+                    <w:rPr>
+                      <w:b w:val="0"/>
+                      <w:sz w:val="16"/>
+                    </w:rPr>
+                    <w:t>49.4</w:t>
+                  </w:r>
+                </w:p>
+              </w:tc>
+              <w:tc>
+                <w:tcPr>
+                  <w:tcW w:type="dxa" w:w="1812"/>
+                </w:tcPr>
+                <w:p>
+                  <w:r>
+                    <w:rPr>
+                      <w:b w:val="0"/>
+                      <w:sz w:val="16"/>
+                    </w:rPr>
+                    <w:t>77.78</w:t>
                   </w:r>
                 </w:p>
               </w:tc>
@@ -1301,49 +1301,49 @@
                       <w:b w:val="0"/>
                       <w:sz w:val="16"/>
                     </w:rPr>
-                    <w:t>22</w:t>
-                  </w:r>
-                </w:p>
-              </w:tc>
-              <w:tc>
-                <w:tcPr>
-                  <w:tcW w:type="dxa" w:w="1812"/>
-                </w:tcPr>
-                <w:p>
-                  <w:r>
-                    <w:rPr>
-                      <w:b w:val="0"/>
-                      <w:sz w:val="16"/>
-                    </w:rPr>
-                    <w:t>1.13</w:t>
-                  </w:r>
-                </w:p>
-              </w:tc>
-              <w:tc>
-                <w:tcPr>
-                  <w:tcW w:type="dxa" w:w="1812"/>
-                </w:tcPr>
-                <w:p>
-                  <w:r>
-                    <w:rPr>
-                      <w:b w:val="0"/>
-                      <w:sz w:val="16"/>
-                    </w:rPr>
-                    <w:t>7.3</w:t>
-                  </w:r>
-                </w:p>
-              </w:tc>
-              <w:tc>
-                <w:tcPr>
-                  <w:tcW w:type="dxa" w:w="1812"/>
-                </w:tcPr>
-                <w:p>
-                  <w:r>
-                    <w:rPr>
-                      <w:b w:val="0"/>
-                      <w:sz w:val="16"/>
-                    </w:rPr>
-                    <w:t>63.64</w:t>
+                    <w:t>23</w:t>
+                  </w:r>
+                </w:p>
+              </w:tc>
+              <w:tc>
+                <w:tcPr>
+                  <w:tcW w:type="dxa" w:w="1812"/>
+                </w:tcPr>
+                <w:p>
+                  <w:r>
+                    <w:rPr>
+                      <w:b w:val="0"/>
+                      <w:sz w:val="16"/>
+                    </w:rPr>
+                    <w:t>0.91</w:t>
+                  </w:r>
+                </w:p>
+              </w:tc>
+              <w:tc>
+                <w:tcPr>
+                  <w:tcW w:type="dxa" w:w="1812"/>
+                </w:tcPr>
+                <w:p>
+                  <w:r>
+                    <w:rPr>
+                      <w:b w:val="0"/>
+                      <w:sz w:val="16"/>
+                    </w:rPr>
+                    <w:t>5.2</w:t>
+                  </w:r>
+                </w:p>
+              </w:tc>
+              <w:tc>
+                <w:tcPr>
+                  <w:tcW w:type="dxa" w:w="1812"/>
+                </w:tcPr>
+                <w:p>
+                  <w:r>
+                    <w:rPr>
+                      <w:b w:val="0"/>
+                      <w:sz w:val="16"/>
+                    </w:rPr>
+                    <w:t>60.87</w:t>
                   </w:r>
                 </w:p>
               </w:tc>
@@ -1359,7 +1359,7 @@
                       <w:b w:val="0"/>
                       <w:sz w:val="16"/>
                     </w:rPr>
-                    <w:t>Muslim</w:t>
+                    <w:t>Buddhist</w:t>
                   </w:r>
                 </w:p>
               </w:tc>
@@ -1387,35 +1387,35 @@
                       <w:b w:val="0"/>
                       <w:sz w:val="16"/>
                     </w:rPr>
-                    <w:t>2.69</w:t>
-                  </w:r>
-                </w:p>
-              </w:tc>
-              <w:tc>
-                <w:tcPr>
-                  <w:tcW w:type="dxa" w:w="1812"/>
-                </w:tcPr>
-                <w:p>
-                  <w:r>
-                    <w:rPr>
-                      <w:b w:val="0"/>
-                      <w:sz w:val="16"/>
-                    </w:rPr>
-                    <w:t>17.3</w:t>
-                  </w:r>
-                </w:p>
-              </w:tc>
-              <w:tc>
-                <w:tcPr>
-                  <w:tcW w:type="dxa" w:w="1812"/>
-                </w:tcPr>
-                <w:p>
-                  <w:r>
-                    <w:rPr>
-                      <w:b w:val="0"/>
-                      <w:sz w:val="16"/>
-                    </w:rPr>
-                    <w:t>100.0</w:t>
+                    <w:t>0.69</w:t>
+                  </w:r>
+                </w:p>
+              </w:tc>
+              <w:tc>
+                <w:tcPr>
+                  <w:tcW w:type="dxa" w:w="1812"/>
+                </w:tcPr>
+                <w:p>
+                  <w:r>
+                    <w:rPr>
+                      <w:b w:val="0"/>
+                      <w:sz w:val="16"/>
+                    </w:rPr>
+                    <w:t>4.0</w:t>
+                  </w:r>
+                </w:p>
+              </w:tc>
+              <w:tc>
+                <w:tcPr>
+                  <w:tcW w:type="dxa" w:w="1812"/>
+                </w:tcPr>
+                <w:p>
+                  <w:r>
+                    <w:rPr>
+                      <w:b w:val="0"/>
+                      <w:sz w:val="16"/>
+                    </w:rPr>
+                    <w:t>71.43</w:t>
                   </w:r>
                 </w:p>
               </w:tc>
@@ -1431,7 +1431,7 @@
                       <w:b w:val="0"/>
                       <w:sz w:val="16"/>
                     </w:rPr>
-                    <w:t>Christian</w:t>
+                    <w:t>Muslim</w:t>
                   </w:r>
                 </w:p>
               </w:tc>
@@ -1459,35 +1459,35 @@
                       <w:b w:val="0"/>
                       <w:sz w:val="16"/>
                     </w:rPr>
-                    <w:t>2.1</w:t>
-                  </w:r>
-                </w:p>
-              </w:tc>
-              <w:tc>
-                <w:tcPr>
-                  <w:tcW w:type="dxa" w:w="1812"/>
-                </w:tcPr>
-                <w:p>
-                  <w:r>
-                    <w:rPr>
-                      <w:b w:val="0"/>
-                      <w:sz w:val="16"/>
-                    </w:rPr>
-                    <w:t>13.5</w:t>
-                  </w:r>
-                </w:p>
-              </w:tc>
-              <w:tc>
-                <w:tcPr>
-                  <w:tcW w:type="dxa" w:w="1812"/>
-                </w:tcPr>
-                <w:p>
-                  <w:r>
-                    <w:rPr>
-                      <w:b w:val="0"/>
-                      <w:sz w:val="16"/>
-                    </w:rPr>
-                    <w:t>14.29</w:t>
+                    <w:t>3.41</w:t>
+                  </w:r>
+                </w:p>
+              </w:tc>
+              <w:tc>
+                <w:tcPr>
+                  <w:tcW w:type="dxa" w:w="1812"/>
+                </w:tcPr>
+                <w:p>
+                  <w:r>
+                    <w:rPr>
+                      <w:b w:val="0"/>
+                      <w:sz w:val="16"/>
+                    </w:rPr>
+                    <w:t>19.6</w:t>
+                  </w:r>
+                </w:p>
+              </w:tc>
+              <w:tc>
+                <w:tcPr>
+                  <w:tcW w:type="dxa" w:w="1812"/>
+                </w:tcPr>
+                <w:p>
+                  <w:r>
+                    <w:rPr>
+                      <w:b w:val="0"/>
+                      <w:sz w:val="16"/>
+                    </w:rPr>
+                    <w:t>100.0</w:t>
                   </w:r>
                 </w:p>
               </w:tc>
@@ -1503,63 +1503,63 @@
                       <w:b w:val="0"/>
                       <w:sz w:val="16"/>
                     </w:rPr>
-                    <w:t>Buddhist</w:t>
-                  </w:r>
-                </w:p>
-              </w:tc>
-              <w:tc>
-                <w:tcPr>
-                  <w:tcW w:type="dxa" w:w="1812"/>
-                </w:tcPr>
-                <w:p>
-                  <w:r>
-                    <w:rPr>
-                      <w:b w:val="0"/>
-                      <w:sz w:val="16"/>
-                    </w:rPr>
-                    <w:t>6</w:t>
-                  </w:r>
-                </w:p>
-              </w:tc>
-              <w:tc>
-                <w:tcPr>
-                  <w:tcW w:type="dxa" w:w="1812"/>
-                </w:tcPr>
-                <w:p>
-                  <w:r>
-                    <w:rPr>
-                      <w:b w:val="0"/>
-                      <w:sz w:val="16"/>
-                    </w:rPr>
-                    <w:t>0.63</w:t>
-                  </w:r>
-                </w:p>
-              </w:tc>
-              <w:tc>
-                <w:tcPr>
-                  <w:tcW w:type="dxa" w:w="1812"/>
-                </w:tcPr>
-                <w:p>
-                  <w:r>
-                    <w:rPr>
-                      <w:b w:val="0"/>
-                      <w:sz w:val="16"/>
-                    </w:rPr>
-                    <w:t>4.0</w:t>
-                  </w:r>
-                </w:p>
-              </w:tc>
-              <w:tc>
-                <w:tcPr>
-                  <w:tcW w:type="dxa" w:w="1812"/>
-                </w:tcPr>
-                <w:p>
-                  <w:r>
-                    <w:rPr>
-                      <w:b w:val="0"/>
-                      <w:sz w:val="16"/>
-                    </w:rPr>
-                    <w:t>83.33</w:t>
+                    <w:t>Christian</w:t>
+                  </w:r>
+                </w:p>
+              </w:tc>
+              <w:tc>
+                <w:tcPr>
+                  <w:tcW w:type="dxa" w:w="1812"/>
+                </w:tcPr>
+                <w:p>
+                  <w:r>
+                    <w:rPr>
+                      <w:b w:val="0"/>
+                      <w:sz w:val="16"/>
+                    </w:rPr>
+                    <w:t>7</w:t>
+                  </w:r>
+                </w:p>
+              </w:tc>
+              <w:tc>
+                <w:tcPr>
+                  <w:tcW w:type="dxa" w:w="1812"/>
+                </w:tcPr>
+                <w:p>
+                  <w:r>
+                    <w:rPr>
+                      <w:b w:val="0"/>
+                      <w:sz w:val="16"/>
+                    </w:rPr>
+                    <w:t>2.07</w:t>
+                  </w:r>
+                </w:p>
+              </w:tc>
+              <w:tc>
+                <w:tcPr>
+                  <w:tcW w:type="dxa" w:w="1812"/>
+                </w:tcPr>
+                <w:p>
+                  <w:r>
+                    <w:rPr>
+                      <w:b w:val="0"/>
+                      <w:sz w:val="16"/>
+                    </w:rPr>
+                    <w:t>11.9</w:t>
+                  </w:r>
+                </w:p>
+              </w:tc>
+              <w:tc>
+                <w:tcPr>
+                  <w:tcW w:type="dxa" w:w="1812"/>
+                </w:tcPr>
+                <w:p>
+                  <w:r>
+                    <w:rPr>
+                      <w:b w:val="0"/>
+                      <w:sz w:val="16"/>
+                    </w:rPr>
+                    <w:t>14.29</w:t>
                   </w:r>
                 </w:p>
               </w:tc>
@@ -1603,35 +1603,35 @@
                       <w:b w:val="0"/>
                       <w:sz w:val="16"/>
                     </w:rPr>
-                    <w:t>0.43</w:t>
-                  </w:r>
-                </w:p>
-              </w:tc>
-              <w:tc>
-                <w:tcPr>
-                  <w:tcW w:type="dxa" w:w="1812"/>
-                </w:tcPr>
-                <w:p>
-                  <w:r>
-                    <w:rPr>
-                      <w:b w:val="0"/>
-                      <w:sz w:val="16"/>
-                    </w:rPr>
-                    <w:t>2.8</w:t>
-                  </w:r>
-                </w:p>
-              </w:tc>
-              <w:tc>
-                <w:tcPr>
-                  <w:tcW w:type="dxa" w:w="1812"/>
-                </w:tcPr>
-                <w:p>
-                  <w:r>
-                    <w:rPr>
-                      <w:b w:val="0"/>
-                      <w:sz w:val="16"/>
-                    </w:rPr>
-                    <w:t>60.0</w:t>
+                    <w:t>0.73</w:t>
+                  </w:r>
+                </w:p>
+              </w:tc>
+              <w:tc>
+                <w:tcPr>
+                  <w:tcW w:type="dxa" w:w="1812"/>
+                </w:tcPr>
+                <w:p>
+                  <w:r>
+                    <w:rPr>
+                      <w:b w:val="0"/>
+                      <w:sz w:val="16"/>
+                    </w:rPr>
+                    <w:t>4.2</w:t>
+                  </w:r>
+                </w:p>
+              </w:tc>
+              <w:tc>
+                <w:tcPr>
+                  <w:tcW w:type="dxa" w:w="1812"/>
+                </w:tcPr>
+                <w:p>
+                  <w:r>
+                    <w:rPr>
+                      <w:b w:val="0"/>
+                      <w:sz w:val="16"/>
+                    </w:rPr>
+                    <w:t>80.0</w:t>
                   </w:r>
                 </w:p>
               </w:tc>
@@ -1675,21 +1675,21 @@
                       <w:b w:val="0"/>
                       <w:sz w:val="16"/>
                     </w:rPr>
-                    <w:t>0.51</w:t>
-                  </w:r>
-                </w:p>
-              </w:tc>
-              <w:tc>
-                <w:tcPr>
-                  <w:tcW w:type="dxa" w:w="1812"/>
-                </w:tcPr>
-                <w:p>
-                  <w:r>
-                    <w:rPr>
-                      <w:b w:val="0"/>
-                      <w:sz w:val="16"/>
-                    </w:rPr>
-                    <w:t>3.3</w:t>
+                    <w:t>0.36</w:t>
+                  </w:r>
+                </w:p>
+              </w:tc>
+              <w:tc>
+                <w:tcPr>
+                  <w:tcW w:type="dxa" w:w="1812"/>
+                </w:tcPr>
+                <w:p>
+                  <w:r>
+                    <w:rPr>
+                      <w:b w:val="0"/>
+                      <w:sz w:val="16"/>
+                    </w:rPr>
+                    <w:t>2.1</w:t>
                   </w:r>
                 </w:p>
               </w:tc>
@@ -1747,21 +1747,21 @@
                       <w:b w:val="0"/>
                       <w:sz w:val="16"/>
                     </w:rPr>
-                    <w:t>0.37</w:t>
-                  </w:r>
-                </w:p>
-              </w:tc>
-              <w:tc>
-                <w:tcPr>
-                  <w:tcW w:type="dxa" w:w="1812"/>
-                </w:tcPr>
-                <w:p>
-                  <w:r>
-                    <w:rPr>
-                      <w:b w:val="0"/>
-                      <w:sz w:val="16"/>
-                    </w:rPr>
-                    <w:t>2.4</w:t>
+                    <w:t>0.53</w:t>
+                  </w:r>
+                </w:p>
+              </w:tc>
+              <w:tc>
+                <w:tcPr>
+                  <w:tcW w:type="dxa" w:w="1812"/>
+                </w:tcPr>
+                <w:p>
+                  <w:r>
+                    <w:rPr>
+                      <w:b w:val="0"/>
+                      <w:sz w:val="16"/>
+                    </w:rPr>
+                    <w:t>3.1</w:t>
                   </w:r>
                 </w:p>
               </w:tc>
@@ -1819,21 +1819,21 @@
                       <w:b w:val="0"/>
                       <w:sz w:val="16"/>
                     </w:rPr>
-                    <w:t>0.44</w:t>
-                  </w:r>
-                </w:p>
-              </w:tc>
-              <w:tc>
-                <w:tcPr>
-                  <w:tcW w:type="dxa" w:w="1812"/>
-                </w:tcPr>
-                <w:p>
-                  <w:r>
-                    <w:rPr>
-                      <w:b w:val="0"/>
-                      <w:sz w:val="16"/>
-                    </w:rPr>
-                    <w:t>2.9</w:t>
+                    <w:t>0.09</w:t>
+                  </w:r>
+                </w:p>
+              </w:tc>
+              <w:tc>
+                <w:tcPr>
+                  <w:tcW w:type="dxa" w:w="1812"/>
+                </w:tcPr>
+                <w:p>
+                  <w:r>
+                    <w:rPr>
+                      <w:b w:val="0"/>
+                      <w:sz w:val="16"/>
+                    </w:rPr>
+                    <w:t>0.5</w:t>
                   </w:r>
                 </w:p>
               </w:tc>
@@ -1863,7 +1863,7 @@
                 <w:b w:val="0"/>
                 <w:sz w:val="20"/>
               </w:rPr>
-              <w:t>Limitations: RBI publishes one combined label per date, so co-listed festivals share the day (39 of 99 festivals never appear alone -&gt; reach flagged not identifiable); bank holidays measure official recognition, not participation; trade figures are industry estimates.</w:t>
+              <w:t>Limitations: 19 of 101 festivals always share their date, so their state coverage stays uncertain (flagged); festivals without a bank holiday, restricted and district-level holidays and UTs without an RBI office are not covered; bank holidays measure official recognition, not participation; trade figures are industry estimates.</w:t>
             </w:r>
           </w:p>
         </w:tc>
@@ -2050,7 +2050,7 @@
                       <w:b w:val="0"/>
                       <w:sz w:val="16"/>
                     </w:rPr>
-                    <w:t>99.0</w:t>
+                    <w:t>101.0</w:t>
                   </w:r>
                 </w:p>
               </w:tc>
@@ -2064,7 +2064,7 @@
                       <w:b w:val="0"/>
                       <w:sz w:val="16"/>
                     </w:rPr>
-                    <w:t>4.11</w:t>
+                    <w:t>4.29</w:t>
                   </w:r>
                 </w:p>
               </w:tc>
@@ -2078,7 +2078,7 @@
                       <w:b w:val="0"/>
                       <w:sz w:val="16"/>
                     </w:rPr>
-                    <w:t>1.27</w:t>
+                    <w:t>1.03</w:t>
                   </w:r>
                 </w:p>
               </w:tc>
@@ -2092,7 +2092,7 @@
                       <w:b w:val="0"/>
                       <w:sz w:val="16"/>
                     </w:rPr>
-                    <w:t>6.32</w:t>
+                    <w:t>7.0</w:t>
                   </w:r>
                 </w:p>
               </w:tc>
@@ -2106,7 +2106,7 @@
                       <w:b w:val="0"/>
                       <w:sz w:val="16"/>
                     </w:rPr>
-                    <w:t>2.44</w:t>
+                    <w:t>2.22</w:t>
                   </w:r>
                 </w:p>
               </w:tc>
@@ -2136,7 +2136,7 @@
                       <w:b w:val="0"/>
                       <w:sz w:val="16"/>
                     </w:rPr>
-                    <w:t>99.0</w:t>
+                    <w:t>101.0</w:t>
                   </w:r>
                 </w:p>
               </w:tc>
@@ -2150,7 +2150,7 @@
                       <w:b w:val="0"/>
                       <w:sz w:val="16"/>
                     </w:rPr>
-                    <w:t>1.03</w:t>
+                    <w:t>1.05</w:t>
                   </w:r>
                 </w:p>
               </w:tc>
@@ -2178,7 +2178,7 @@
                       <w:b w:val="0"/>
                       <w:sz w:val="16"/>
                     </w:rPr>
-                    <w:t>0.09</w:t>
+                    <w:t>0.18</w:t>
                   </w:r>
                 </w:p>
               </w:tc>
@@ -2192,7 +2192,7 @@
                       <w:b w:val="0"/>
                       <w:sz w:val="16"/>
                     </w:rPr>
-                    <w:t>4.44</w:t>
+                    <w:t>4.11</w:t>
                   </w:r>
                 </w:p>
               </w:tc>
@@ -2222,7 +2222,7 @@
                       <w:b w:val="0"/>
                       <w:sz w:val="16"/>
                     </w:rPr>
-                    <w:t>64.0</w:t>
+                    <w:t>69.0</w:t>
                   </w:r>
                 </w:p>
               </w:tc>
@@ -2236,7 +2236,7 @@
                       <w:b w:val="0"/>
                       <w:sz w:val="16"/>
                     </w:rPr>
-                    <w:t>23.19</w:t>
+                    <w:t>31.65</w:t>
                   </w:r>
                 </w:p>
               </w:tc>
@@ -2250,7 +2250,7 @@
                       <w:b w:val="0"/>
                       <w:sz w:val="16"/>
                     </w:rPr>
-                    <w:t>19.0</w:t>
+                    <w:t>22.0</w:t>
                   </w:r>
                 </w:p>
               </w:tc>
@@ -2264,7 +2264,7 @@
                       <w:b w:val="0"/>
                       <w:sz w:val="16"/>
                     </w:rPr>
-                    <w:t>43.7</w:t>
+                    <w:t>58.01</w:t>
                   </w:r>
                 </w:p>
               </w:tc>
@@ -2278,7 +2278,7 @@
                       <w:b w:val="0"/>
                       <w:sz w:val="16"/>
                     </w:rPr>
-                    <w:t>7.65</w:t>
+                    <w:t>5.38</w:t>
                   </w:r>
                 </w:p>
               </w:tc>
@@ -2322,7 +2322,7 @@
                       <w:b w:val="0"/>
                       <w:sz w:val="16"/>
                     </w:rPr>
-                    <w:t>15.39</w:t>
+                    <w:t>17.01</w:t>
                   </w:r>
                 </w:p>
               </w:tc>
@@ -2336,7 +2336,7 @@
                       <w:b w:val="0"/>
                       <w:sz w:val="16"/>
                     </w:rPr>
-                    <w:t>15.32</w:t>
+                    <w:t>17.23</w:t>
                   </w:r>
                 </w:p>
               </w:tc>
@@ -2350,7 +2350,7 @@
                       <w:b w:val="0"/>
                       <w:sz w:val="16"/>
                     </w:rPr>
-                    <w:t>2.49</w:t>
+                    <w:t>3.44</w:t>
                   </w:r>
                 </w:p>
               </w:tc>
@@ -2364,7 +2364,7 @@
                       <w:b w:val="0"/>
                       <w:sz w:val="16"/>
                     </w:rPr>
-                    <w:t>0.27</w:t>
+                    <w:t>-0.5</w:t>
                   </w:r>
                 </w:p>
               </w:tc>
@@ -2408,7 +2408,7 @@
                       <w:b w:val="0"/>
                       <w:sz w:val="16"/>
                     </w:rPr>
-                    <w:t>1.54</w:t>
+                    <w:t>1.33</w:t>
                   </w:r>
                 </w:p>
               </w:tc>
@@ -2422,7 +2422,7 @@
                       <w:b w:val="0"/>
                       <w:sz w:val="16"/>
                     </w:rPr>
-                    <w:t>1.52</w:t>
+                    <w:t>1.3</w:t>
                   </w:r>
                 </w:p>
               </w:tc>
@@ -2436,7 +2436,7 @@
                       <w:b w:val="0"/>
                       <w:sz w:val="16"/>
                     </w:rPr>
-                    <w:t>0.14</w:t>
+                    <w:t>0.18</w:t>
                   </w:r>
                 </w:p>
               </w:tc>
@@ -2494,7 +2494,7 @@
                       <w:b w:val="0"/>
                       <w:sz w:val="16"/>
                     </w:rPr>
-                    <w:t>34.97</w:t>
+                    <w:t>14.59</w:t>
                   </w:r>
                 </w:p>
               </w:tc>
@@ -2508,7 +2508,7 @@
                       <w:b w:val="0"/>
                       <w:sz w:val="16"/>
                     </w:rPr>
-                    <w:t>35.0</w:t>
+                    <w:t>15.0</w:t>
                   </w:r>
                 </w:p>
               </w:tc>
@@ -2522,7 +2522,7 @@
                       <w:b w:val="0"/>
                       <w:sz w:val="16"/>
                     </w:rPr>
-                    <w:t>5.68</w:t>
+                    <w:t>2.99</w:t>
                   </w:r>
                 </w:p>
               </w:tc>
@@ -2536,7 +2536,7 @@
                       <w:b w:val="0"/>
                       <w:sz w:val="16"/>
                     </w:rPr>
-                    <w:t>-0.52</w:t>
+                    <w:t>-0.78</w:t>
                   </w:r>
                 </w:p>
               </w:tc>
@@ -2765,7 +2765,7 @@
                       <w:b w:val="0"/>
                       <w:sz w:val="16"/>
                     </w:rPr>
-                    <w:t>551.155</w:t>
+                    <w:t>825.499</w:t>
                   </w:r>
                 </w:p>
               </w:tc>
@@ -2837,21 +2837,21 @@
                       <w:b w:val="0"/>
                       <w:sz w:val="16"/>
                     </w:rPr>
-                    <w:t>7.719</w:t>
-                  </w:r>
-                </w:p>
-              </w:tc>
-              <w:tc>
-                <w:tcPr>
-                  <w:tcW w:type="dxa" w:w="1812"/>
-                </w:tcPr>
-                <w:p>
-                  <w:r>
-                    <w:rPr>
-                      <w:b w:val="0"/>
-                      <w:sz w:val="16"/>
-                    </w:rPr>
-                    <w:t>0.578</w:t>
+                    <w:t>5.691</w:t>
+                  </w:r>
+                </w:p>
+              </w:tc>
+              <w:tc>
+                <w:tcPr>
+                  <w:tcW w:type="dxa" w:w="1812"/>
+                </w:tcPr>
+                <w:p>
+                  <w:r>
+                    <w:rPr>
+                      <w:b w:val="0"/>
+                      <w:sz w:val="16"/>
+                    </w:rPr>
+                    <w:t>0.785</w:t>
                   </w:r>
                 </w:p>
               </w:tc>
@@ -2909,21 +2909,21 @@
                       <w:b w:val="0"/>
                       <w:sz w:val="16"/>
                     </w:rPr>
-                    <w:t>0.575</w:t>
-                  </w:r>
-                </w:p>
-              </w:tc>
-              <w:tc>
-                <w:tcPr>
-                  <w:tcW w:type="dxa" w:w="1812"/>
-                </w:tcPr>
-                <w:p>
-                  <w:r>
-                    <w:rPr>
-                      <w:b w:val="0"/>
-                      <w:sz w:val="16"/>
-                    </w:rPr>
-                    <w:t>0.001</w:t>
+                    <w:t>0.614</w:t>
+                  </w:r>
+                </w:p>
+              </w:tc>
+              <w:tc>
+                <w:tcPr>
+                  <w:tcW w:type="dxa" w:w="1812"/>
+                </w:tcPr>
+                <w:p>
+                  <w:r>
+                    <w:rPr>
+                      <w:b w:val="0"/>
+                      <w:sz w:val="16"/>
+                    </w:rPr>
+                    <w:t>&lt; 0.001</w:t>
                   </w:r>
                 </w:p>
               </w:tc>
@@ -2981,21 +2981,21 @@
                       <w:b w:val="0"/>
                       <w:sz w:val="16"/>
                     </w:rPr>
-                    <w:t>0.422</w:t>
-                  </w:r>
-                </w:p>
-              </w:tc>
-              <w:tc>
-                <w:tcPr>
-                  <w:tcW w:type="dxa" w:w="1812"/>
-                </w:tcPr>
-                <w:p>
-                  <w:r>
-                    <w:rPr>
-                      <w:b w:val="0"/>
-                      <w:sz w:val="16"/>
-                    </w:rPr>
-                    <w:t>0.022</w:t>
+                    <w:t>0.384</w:t>
+                  </w:r>
+                </w:p>
+              </w:tc>
+              <w:tc>
+                <w:tcPr>
+                  <w:tcW w:type="dxa" w:w="1812"/>
+                </w:tcPr>
+                <w:p>
+                  <w:r>
+                    <w:rPr>
+                      <w:b w:val="0"/>
+                      <w:sz w:val="16"/>
+                    </w:rPr>
+                    <w:t>0.040</w:t>
                   </w:r>
                 </w:p>
               </w:tc>
@@ -3053,21 +3053,21 @@
                       <w:b w:val="0"/>
                       <w:sz w:val="16"/>
                     </w:rPr>
-                    <w:t>0.532</w:t>
-                  </w:r>
-                </w:p>
-              </w:tc>
-              <w:tc>
-                <w:tcPr>
-                  <w:tcW w:type="dxa" w:w="1812"/>
-                </w:tcPr>
-                <w:p>
-                  <w:r>
-                    <w:rPr>
-                      <w:b w:val="0"/>
-                      <w:sz w:val="16"/>
-                    </w:rPr>
-                    <w:t>0.003</w:t>
+                    <w:t>0.495</w:t>
+                  </w:r>
+                </w:p>
+              </w:tc>
+              <w:tc>
+                <w:tcPr>
+                  <w:tcW w:type="dxa" w:w="1812"/>
+                </w:tcPr>
+                <w:p>
+                  <w:r>
+                    <w:rPr>
+                      <w:b w:val="0"/>
+                      <w:sz w:val="16"/>
+                    </w:rPr>
+                    <w:t>0.006</w:t>
                   </w:r>
                 </w:p>
               </w:tc>
@@ -3125,21 +3125,21 @@
                       <w:b w:val="0"/>
                       <w:sz w:val="16"/>
                     </w:rPr>
-                    <w:t>0.536</w:t>
-                  </w:r>
-                </w:p>
-              </w:tc>
-              <w:tc>
-                <w:tcPr>
-                  <w:tcW w:type="dxa" w:w="1812"/>
-                </w:tcPr>
-                <w:p>
-                  <w:r>
-                    <w:rPr>
-                      <w:b w:val="0"/>
-                      <w:sz w:val="16"/>
-                    </w:rPr>
-                    <w:t>0.003</w:t>
+                    <w:t>0.642</w:t>
+                  </w:r>
+                </w:p>
+              </w:tc>
+              <w:tc>
+                <w:tcPr>
+                  <w:tcW w:type="dxa" w:w="1812"/>
+                </w:tcPr>
+                <w:p>
+                  <w:r>
+                    <w:rPr>
+                      <w:b w:val="0"/>
+                      <w:sz w:val="16"/>
+                    </w:rPr>
+                    <w:t>&lt; 0.001</w:t>
                   </w:r>
                 </w:p>
               </w:tc>
@@ -3197,7 +3197,7 @@
                       <w:b w:val="0"/>
                       <w:sz w:val="16"/>
                     </w:rPr>
-                    <w:t>0.709</w:t>
+                    <w:t>0.645</w:t>
                   </w:r>
                 </w:p>
               </w:tc>
@@ -3269,7 +3269,7 @@
                       <w:b w:val="0"/>
                       <w:sz w:val="16"/>
                     </w:rPr>
-                    <w:t>0.639</w:t>
+                    <w:t>0.662</w:t>
                   </w:r>
                 </w:p>
               </w:tc>
@@ -3341,35 +3341,35 @@
                       <w:b w:val="0"/>
                       <w:sz w:val="16"/>
                     </w:rPr>
-                    <w:t>7.251</w:t>
-                  </w:r>
-                </w:p>
-              </w:tc>
-              <w:tc>
-                <w:tcPr>
-                  <w:tcW w:type="dxa" w:w="1812"/>
-                </w:tcPr>
-                <w:p>
-                  <w:r>
-                    <w:rPr>
-                      <w:b w:val="0"/>
-                      <w:sz w:val="16"/>
-                    </w:rPr>
-                    <w:t>0.064</w:t>
-                  </w:r>
-                </w:p>
-              </w:tc>
-              <w:tc>
-                <w:tcPr>
-                  <w:tcW w:type="dxa" w:w="1812"/>
-                </w:tcPr>
-                <w:p>
-                  <w:r>
-                    <w:rPr>
-                      <w:b w:val="0"/>
-                      <w:sz w:val="16"/>
-                    </w:rPr>
-                    <w:t>Fail to reject H0</w:t>
+                    <w:t>10.283</w:t>
+                  </w:r>
+                </w:p>
+              </w:tc>
+              <w:tc>
+                <w:tcPr>
+                  <w:tcW w:type="dxa" w:w="1812"/>
+                </w:tcPr>
+                <w:p>
+                  <w:r>
+                    <w:rPr>
+                      <w:b w:val="0"/>
+                      <w:sz w:val="16"/>
+                    </w:rPr>
+                    <w:t>0.016</w:t>
+                  </w:r>
+                </w:p>
+              </w:tc>
+              <w:tc>
+                <w:tcPr>
+                  <w:tcW w:type="dxa" w:w="1812"/>
+                </w:tcPr>
+                <w:p>
+                  <w:r>
+                    <w:rPr>
+                      <w:b w:val="0"/>
+                      <w:sz w:val="16"/>
+                    </w:rPr>
+                    <w:t>Reject H0</w:t>
                   </w:r>
                 </w:p>
               </w:tc>
@@ -3413,21 +3413,21 @@
                       <w:b w:val="0"/>
                       <w:sz w:val="16"/>
                     </w:rPr>
-                    <w:t>885.500</w:t>
-                  </w:r>
-                </w:p>
-              </w:tc>
-              <w:tc>
-                <w:tcPr>
-                  <w:tcW w:type="dxa" w:w="1812"/>
-                </w:tcPr>
-                <w:p>
-                  <w:r>
-                    <w:rPr>
-                      <w:b w:val="0"/>
-                      <w:sz w:val="16"/>
-                    </w:rPr>
-                    <w:t>0.270</w:t>
+                    <w:t>870.500</w:t>
+                  </w:r>
+                </w:p>
+              </w:tc>
+              <w:tc>
+                <w:tcPr>
+                  <w:tcW w:type="dxa" w:w="1812"/>
+                </w:tcPr>
+                <w:p>
+                  <w:r>
+                    <w:rPr>
+                      <w:b w:val="0"/>
+                      <w:sz w:val="16"/>
+                    </w:rPr>
+                    <w:t>0.708</w:t>
                   </w:r>
                 </w:p>
               </w:tc>
@@ -3485,21 +3485,21 @@
                       <w:b w:val="0"/>
                       <w:sz w:val="16"/>
                     </w:rPr>
-                    <w:t>3.788</w:t>
-                  </w:r>
-                </w:p>
-              </w:tc>
-              <w:tc>
-                <w:tcPr>
-                  <w:tcW w:type="dxa" w:w="1812"/>
-                </w:tcPr>
-                <w:p>
-                  <w:r>
-                    <w:rPr>
-                      <w:b w:val="0"/>
-                      <w:sz w:val="16"/>
-                    </w:rPr>
-                    <w:t>0.580</w:t>
+                    <w:t>2.362</w:t>
+                  </w:r>
+                </w:p>
+              </w:tc>
+              <w:tc>
+                <w:tcPr>
+                  <w:tcW w:type="dxa" w:w="1812"/>
+                </w:tcPr>
+                <w:p>
+                  <w:r>
+                    <w:rPr>
+                      <w:b w:val="0"/>
+                      <w:sz w:val="16"/>
+                    </w:rPr>
+                    <w:t>0.797</w:t>
                   </w:r>
                 </w:p>
               </w:tc>
@@ -3557,21 +3557,21 @@
                       <w:b w:val="0"/>
                       <w:sz w:val="16"/>
                     </w:rPr>
-                    <w:t>4.587</w:t>
-                  </w:r>
-                </w:p>
-              </w:tc>
-              <w:tc>
-                <w:tcPr>
-                  <w:tcW w:type="dxa" w:w="1812"/>
-                </w:tcPr>
-                <w:p>
-                  <w:r>
-                    <w:rPr>
-                      <w:b w:val="0"/>
-                      <w:sz w:val="16"/>
-                    </w:rPr>
-                    <w:t>0.468</w:t>
+                    <w:t>6.225</w:t>
+                  </w:r>
+                </w:p>
+              </w:tc>
+              <w:tc>
+                <w:tcPr>
+                  <w:tcW w:type="dxa" w:w="1812"/>
+                </w:tcPr>
+                <w:p>
+                  <w:r>
+                    <w:rPr>
+                      <w:b w:val="0"/>
+                      <w:sz w:val="16"/>
+                    </w:rPr>
+                    <w:t>0.285</w:t>
                   </w:r>
                 </w:p>
               </w:tc>
@@ -3629,21 +3629,21 @@
                       <w:b w:val="0"/>
                       <w:sz w:val="16"/>
                     </w:rPr>
-                    <w:t>0.248</w:t>
-                  </w:r>
-                </w:p>
-              </w:tc>
-              <w:tc>
-                <w:tcPr>
-                  <w:tcW w:type="dxa" w:w="1812"/>
-                </w:tcPr>
-                <w:p>
-                  <w:r>
-                    <w:rPr>
-                      <w:b w:val="0"/>
-                      <w:sz w:val="16"/>
-                    </w:rPr>
-                    <w:t>0.194</w:t>
+                    <w:t>0.314</w:t>
+                  </w:r>
+                </w:p>
+              </w:tc>
+              <w:tc>
+                <w:tcPr>
+                  <w:tcW w:type="dxa" w:w="1812"/>
+                </w:tcPr>
+                <w:p>
+                  <w:r>
+                    <w:rPr>
+                      <w:b w:val="0"/>
+                      <w:sz w:val="16"/>
+                    </w:rPr>
+                    <w:t>0.097</w:t>
                   </w:r>
                 </w:p>
               </w:tc>
@@ -3817,7 +3817,7 @@
                 <w:b w:val="0"/>
                 <w:sz w:val="20"/>
               </w:rPr>
-              <w:t>H1: holidays cluster by month (chi2 = 551, p &lt; 0.001; peaks Mar, Oct, Apr). H2: season independent of tradition (perm. p = 0.58). H3: holiday share correlates with population share for all six faiths (rho 0.42-0.71, p &lt; 0.05). H4-H7 not significant. H9: festive trade grows 34.0%/yr (95% CI 27.2 to 41.1).</w:t>
+              <w:t>H1: holidays cluster by month (chi2 = 825, p &lt; 0.001; peaks Mar, Oct, Apr). H2: season independent of tradition (perm. p = 0.78). H3: holiday share correlates with population share for all six faiths (rho 0.38-0.66, all p &lt; 0.05 after Holm correction). H4: reach differs by tradition group (p = 0.016). H5-H8 not significant. H9: festive trade grows 34.0%/yr (95% CI 27.2 to 41.1).</w:t>
             </w:r>
           </w:p>
         </w:tc>
@@ -3882,7 +3882,7 @@
                 <w:b w:val="0"/>
                 <w:sz w:val="20"/>
               </w:rPr>
-              <w:t>Features: Hindu/Muslim/Christian/Tribal shares of festival holidays (chosen by a documented feature-set experiment). k = 4 (silhouette 0.413); bootstrap ARI 0.61 +/- 0.28; ARI vs region 0.03.</w:t>
+              <w:t>Features: Hindu/Muslim/Christian/Tribal shares of festival holidays (chosen by a documented feature-set experiment). k = 2 (silhouette 0.502); bootstrap ARI 0.68 +/- 0.33; ARI vs region 0.01.</w:t>
             </w:r>
           </w:p>
           <w:p>
@@ -3894,7 +3894,7 @@
                 <w:b w:val="0"/>
                 <w:sz w:val="20"/>
               </w:rPr>
-              <w:t>C1: above-avg Christian holiday share: Arunachal Pradesh, Goa, Mizoram, Nagaland; C2: above-avg Hindu holiday share: Andhra Pradesh, Assam, Bihar, Gujarat, Himachal Pradesh, Jharkhand, Karnataka, Madhya Pradesh, Maharashtra, Odisha, Punjab-Haryana-Chandigarh, Rajasthan, Sikkim, Tamil Nadu, Telangana, Uttar Pradesh, Uttarakhand, West Bengal; C3: above-avg Muslim holiday share: Chhattisgarh, Delhi, Jammu &amp; Kashmir, Kerala; C4: above-avg Tribal Indigenous holiday share: Manipur, Meghalaya, Tripura</w:t>
+              <w:t>C1: typical mix: Andhra Pradesh, Arunachal Pradesh, Assam, Bihar, Goa, Gujarat, Himachal Pradesh, Jharkhand, Karnataka, Kerala, Madhya Pradesh, Maharashtra, Odisha, Punjab-Haryana-Chandigarh, Rajasthan, Sikkim, Tamil Nadu, Telangana, Tripura, Uttar Pradesh, Uttarakhand, West Bengal; C2: more Tribal/Indigenous &amp; Christian holidays than average: Manipur, Meghalaya, Mizoram, Nagaland; C3: more Muslim holidays than average: Chhattisgarh, Delhi, Jammu &amp; Kashmir (the 3-group view, silhouette 0.41).</w:t>
             </w:r>
           </w:p>
           <w:p>
@@ -4046,7 +4046,7 @@
                       <w:b w:val="0"/>
                       <w:sz w:val="16"/>
                     </w:rPr>
-                    <w:t>0.455</w:t>
+                    <w:t>0.446</w:t>
                   </w:r>
                 </w:p>
               </w:tc>
@@ -4060,7 +4060,7 @@
                       <w:b w:val="0"/>
                       <w:sz w:val="16"/>
                     </w:rPr>
-                    <w:t>0.114</w:t>
+                    <w:t>0.111</w:t>
                   </w:r>
                 </w:p>
               </w:tc>
@@ -4088,7 +4088,7 @@
                       <w:b w:val="0"/>
                       <w:sz w:val="16"/>
                     </w:rPr>
-                    <w:t>0.156</w:t>
+                    <w:t>0.154</w:t>
                   </w:r>
                 </w:p>
               </w:tc>
@@ -4132,7 +4132,7 @@
                       <w:b w:val="0"/>
                       <w:sz w:val="16"/>
                     </w:rPr>
-                    <w:t>0.434</w:t>
+                    <w:t>0.48</w:t>
                   </w:r>
                 </w:p>
               </w:tc>
@@ -4146,7 +4146,7 @@
                       <w:b w:val="0"/>
                       <w:sz w:val="16"/>
                     </w:rPr>
-                    <w:t>0.42</w:t>
+                    <w:t>0.45</w:t>
                   </w:r>
                 </w:p>
               </w:tc>
@@ -4160,7 +4160,7 @@
                       <w:b w:val="0"/>
                       <w:sz w:val="16"/>
                     </w:rPr>
-                    <w:t>0.424</w:t>
+                    <w:t>0.455</w:t>
                   </w:r>
                 </w:p>
               </w:tc>
@@ -4174,7 +4174,7 @@
                       <w:b w:val="0"/>
                       <w:sz w:val="16"/>
                     </w:rPr>
-                    <w:t>0.4</w:t>
+                    <w:t>0.429</w:t>
                   </w:r>
                 </w:p>
               </w:tc>
@@ -4188,7 +4188,7 @@
                       <w:b w:val="0"/>
                       <w:sz w:val="16"/>
                     </w:rPr>
-                    <w:t>0.106</w:t>
+                    <w:t>0.097</w:t>
                   </w:r>
                 </w:p>
               </w:tc>
@@ -4218,7 +4218,7 @@
                       <w:b w:val="0"/>
                       <w:sz w:val="16"/>
                     </w:rPr>
-                    <w:t>0.464</w:t>
+                    <w:t>0.514</w:t>
                   </w:r>
                 </w:p>
               </w:tc>
@@ -4232,7 +4232,7 @@
                       <w:b w:val="0"/>
                       <w:sz w:val="16"/>
                     </w:rPr>
-                    <w:t>0.419</w:t>
+                    <w:t>0.47</w:t>
                   </w:r>
                 </w:p>
               </w:tc>
@@ -4246,7 +4246,7 @@
                       <w:b w:val="0"/>
                       <w:sz w:val="16"/>
                     </w:rPr>
-                    <w:t>0.424</w:t>
+                    <w:t>0.468</w:t>
                   </w:r>
                 </w:p>
               </w:tc>
@@ -4260,7 +4260,7 @@
                       <w:b w:val="0"/>
                       <w:sz w:val="16"/>
                     </w:rPr>
-                    <w:t>0.404</w:t>
+                    <w:t>0.446</w:t>
                   </w:r>
                 </w:p>
               </w:tc>
@@ -4274,7 +4274,7 @@
                       <w:b w:val="0"/>
                       <w:sz w:val="16"/>
                     </w:rPr>
-                    <w:t>0.105</w:t>
+                    <w:t>0.1</w:t>
                   </w:r>
                 </w:p>
               </w:tc>
@@ -4519,7 +4519,7 @@
                 <w:i/>
                 <w:sz w:val="17"/>
               </w:rPr>
-              <w:t>Fig 1. Festival bank-holiday days by month and tradition (RBI 2024-26).</w:t>
+              <w:t>Fig 1. Festival bank-holiday days by month and tradition (RBI 2022-26).</w:t>
             </w:r>
           </w:p>
           <w:p>
@@ -4945,7 +4945,7 @@
             <w:r>
               <w:drawing>
                 <wp:inline xmlns:a="http://schemas.openxmlformats.org/drawingml/2006/main" xmlns:pic="http://schemas.openxmlformats.org/drawingml/2006/picture">
-                  <wp:extent cx="3474720" cy="4428430"/>
+                  <wp:extent cx="3474720" cy="3845942"/>
                   <wp:docPr id="10" name="Picture 10"/>
                   <wp:cNvGraphicFramePr>
                     <a:graphicFrameLocks noChangeAspect="1"/>
@@ -4966,7 +4966,7 @@
                         <pic:spPr>
                           <a:xfrm>
                             <a:off x="0" y="0"/>
-                            <a:ext cx="3474720" cy="4428430"/>
+                            <a:ext cx="3474720" cy="3845942"/>
                           </a:xfrm>
                           <a:prstGeom prst="rect"/>
                         </pic:spPr>
@@ -5144,7 +5144,7 @@
                 <w:b w:val="0"/>
                 <w:sz w:val="20"/>
               </w:rPr>
-              <w:t>1. Festival holidays peak in March (2.7 days/office), October (2.5) and April (2.1); February and July are quietest.</w:t>
+              <w:t>1. Festival holidays peak in April, October and March (about 2.6-2.8 days per office each); January, February and July are quietest.</w:t>
             </w:r>
           </w:p>
           <w:p>
@@ -5156,7 +5156,7 @@
                 <w:b w:val="0"/>
                 <w:sz w:val="20"/>
               </w:rPr>
-              <w:t>2. Every faith's holiday share rises with its population share (Spearman 0.42-0.71), yet the calendar is more plural than the population: Hindu festivals are ~46% of festival holidays vs 79.8% of population, because Christmas, Good Friday, both Eids, Buddha Purnima, Mahavir Jayanti and Guru Nanak Jayanti are gazetted almost nationwide.</w:t>
+              <w:t>2. Every faith's holiday share rises with its population share (Spearman 0.38-0.66), yet the calendar is more plural than the population: Hindu festivals are ~49% of festival holidays vs 79.8% of population, because Christmas, Good Friday, both Eids, Buddha Purnima, Mahavir Jayanti and Guru Nanak Jayanti are gazetted almost nationwide.</w:t>
             </w:r>
           </w:p>
           <w:p>
@@ -5168,7 +5168,7 @@
                 <w:b w:val="0"/>
                 <w:sz w:val="20"/>
               </w:rPr>
-              <w:t>3. Sikkim (21.2), Uttar Pradesh (19.8) and Jharkhand (19.1) have the most festival holidays; Goa (11.3) the fewest. Regions do not differ significantly.</w:t>
+              <w:t>3. Uttar Pradesh (22.9), Sikkim (22.8) and Jharkhand (22.0) have the most festival holidays; Arunachal Pradesh (9.3) the fewest. Regions do not differ significantly.</w:t>
             </w:r>
           </w:p>
           <w:p>
@@ -5180,7 +5180,7 @@
                 <w:b w:val="0"/>
                 <w:sz w:val="20"/>
               </w:rPr>
-              <w:t>4. States cluster by calendar culture, not geography (ARI vs region 0.03).</w:t>
+              <w:t>4. The strongest state grouping is 2 clusters (four north-eastern hill states vs the rest, silhouette 0.50); calendars otherwise form a continuum that does not follow regions (ARI 0.01).</w:t>
             </w:r>
           </w:p>
           <w:p>
@@ -5192,7 +5192,7 @@
                 <w:b w:val="0"/>
                 <w:sz w:val="20"/>
               </w:rPr>
-              <w:t>5. A festival's date and footprint only weakly reveal its faith (macro-F1 0.40): nationwide festivals of all faiths look alike.</w:t>
+              <w:t>5. A festival's date and footprint only weakly reveal its faith (macro-F1 0.45): nationwide festivals of all faiths look alike.</w:t>
             </w:r>
           </w:p>
           <w:p>

</xml_diff>